<commit_message>
Phase 6.3 closeout — decisions log entry + 6.4 handoff
Co-Authored-By: Claude Opus 4.7 (1M context) <noreply@anthropic.com>
</commit_message>
<xml_diff>
--- a/docs/Bufaisal-Decisions-Log-v1_1-Addendum.docx
+++ b/docs/Bufaisal-Decisions-Log-v1_1-Addendum.docx
@@ -1371,6 +1371,38 @@
     <w:p>
       <w:r>
         <w:t xml:space="preserve"/>
+      </w:r>
+    </w:p>
+    <w:p>
+      <w:pPr>
+        <w:pStyle w:val="Heading1"/>
+      </w:pPr>
+      <w:r>
+        <w:t>2026-05-11 — published_product_schema image placeholders flagged (6.4 prerequisite)</w:t>
+      </w:r>
+    </w:p>
+    <w:p>
+      <w:pPr>
+        <w:spacing w:after="120"/>
+      </w:pPr>
+      <w:r>
+        <w:t>What: During the Phase 6.3 audit, the published_product_schema JSONB column was found to contain literal placeholder strings ("photo_1_url", "photo_2_url", etc.) in its image[] array instead of real Cloudinary URLs. The AI prompt produces these placeholders because the AI does not know the photo URLs at generation time.</w:t>
+      </w:r>
+    </w:p>
+    <w:p>
+      <w:pPr>
+        <w:spacing w:after="120"/>
+      </w:pPr>
+      <w:r>
+        <w:t>Status: Not a blocker for 6.3 (no current consumer reads published_product_schema). MUST be resolved before 6.4, which wires this column into rendered structured data. Without resolution, Google would index "photo_1_url" as the product image and flag the page in Search Console.</w:t>
+      </w:r>
+    </w:p>
+    <w:p>
+      <w:pPr>
+        <w:spacing w:after="120"/>
+      </w:pPr>
+      <w:r>
+        <w:t>Resolution path: At publish time in src/lib/admin-pending-publish.ts, substitute the placeholder tokens in product_schema.image[] with the actual photo URLs from the item's image_urls / worker_photo_brand_url chain (same chain that src/lib/item-image.ts uses). Owner: 6.4 prerequisite.</w:t>
       </w:r>
     </w:p>
     <w:p>

</xml_diff>